<commit_message>
docs: add updated docx and pdf files for wave1-1 dm letter
</commit_message>
<xml_diff>
--- a/public/assets/monsmecta_wave1-1_dm_letter_a4.docx
+++ b/public/assets/monsmecta_wave1-1_dm_letter_a4.docx
@@ -90,7 +90,7 @@
           <w:color w:val="1E293B"/>
           <w:sz w:val="20"/>
         </w:rPr>
-        <w:t>진료 현장에서 파보·로타·코로나 등 중증 바이러스성 장염 및 설사 환축을 치료하시며, 단순히 분변의 수분만 흡수하여 변을 굳히는 기존 인체약 지사제의 한계를 느끼지 않으셨습니까?</w:t>
+        <w:t>진료 현장에서 파보·로타·코로나 등 중증 바이러스성 장염 및 설사 환축 치료 시, 장내 수분·독소·바이러스를 강력히 흡착해 설사를 멎게 하고 손상된 위장 점막을 효과적으로 보호하는 천연 점토(스멕타이트/몬모릴로나이트) 성분 흡착성 지사제 솔루션의 필요성을 잘 알고 계실 것입니다.</w:t>
         <w:br/>
         <w:t xml:space="preserve">이에 에스앤제이(S&amp;J) 동물병원은 (전)서울대학교 수의과대학 출신 자문단과 함께, </w:t>
       </w:r>
@@ -307,40 +307,6 @@
                     <w:spacing w:after="40"/>
                     <w:jc w:val="center"/>
                   </w:pPr>
-                  <w:r>
-                    <w:drawing>
-                      <wp:inline xmlns:a="http://schemas.openxmlformats.org/drawingml/2006/main" xmlns:pic="http://schemas.openxmlformats.org/drawingml/2006/picture">
-                        <wp:extent cx="868680" cy="868680"/>
-                        <wp:docPr id="1" name="Picture 1"/>
-                        <wp:cNvGraphicFramePr>
-                          <a:graphicFrameLocks noChangeAspect="1"/>
-                        </wp:cNvGraphicFramePr>
-                        <a:graphic>
-                          <a:graphicData uri="http://schemas.openxmlformats.org/drawingml/2006/picture">
-                            <pic:pic>
-                              <pic:nvPicPr>
-                                <pic:cNvPr id="0" name="monsmecta_qrcode_snj1.png"/>
-                                <pic:cNvPicPr/>
-                              </pic:nvPicPr>
-                              <pic:blipFill>
-                                <a:blip r:embed="rId9"/>
-                                <a:stretch>
-                                  <a:fillRect/>
-                                </a:stretch>
-                              </pic:blipFill>
-                              <pic:spPr>
-                                <a:xfrm>
-                                  <a:off x="0" y="0"/>
-                                  <a:ext cx="868680" cy="868680"/>
-                                </a:xfrm>
-                                <a:prstGeom prst="rect"/>
-                              </pic:spPr>
-                            </pic:pic>
-                          </a:graphicData>
-                        </a:graphic>
-                      </wp:inline>
-                    </w:drawing>
-                  </w:r>
                 </w:p>
                 <w:p>
                   <w:pPr>
@@ -394,40 +360,6 @@
                     <w:spacing w:after="40"/>
                     <w:jc w:val="center"/>
                   </w:pPr>
-                  <w:r>
-                    <w:drawing>
-                      <wp:inline xmlns:a="http://schemas.openxmlformats.org/drawingml/2006/main" xmlns:pic="http://schemas.openxmlformats.org/drawingml/2006/picture">
-                        <wp:extent cx="868680" cy="868680"/>
-                        <wp:docPr id="2" name="Picture 2"/>
-                        <wp:cNvGraphicFramePr>
-                          <a:graphicFrameLocks noChangeAspect="1"/>
-                        </wp:cNvGraphicFramePr>
-                        <a:graphic>
-                          <a:graphicData uri="http://schemas.openxmlformats.org/drawingml/2006/picture">
-                            <pic:pic>
-                              <pic:nvPicPr>
-                                <pic:cNvPr id="0" name="monsmecta_qrcode_snj2.png"/>
-                                <pic:cNvPicPr/>
-                              </pic:nvPicPr>
-                              <pic:blipFill>
-                                <a:blip r:embed="rId10"/>
-                                <a:stretch>
-                                  <a:fillRect/>
-                                </a:stretch>
-                              </pic:blipFill>
-                              <pic:spPr>
-                                <a:xfrm>
-                                  <a:off x="0" y="0"/>
-                                  <a:ext cx="868680" cy="868680"/>
-                                </a:xfrm>
-                                <a:prstGeom prst="rect"/>
-                              </pic:spPr>
-                            </pic:pic>
-                          </a:graphicData>
-                        </a:graphic>
-                      </wp:inline>
-                    </w:drawing>
-                  </w:r>
                 </w:p>
                 <w:p>
                   <w:pPr>

</xml_diff>

<commit_message>
Refine DM letter headlines with exact copy for Gas-Whal-Myung-Su for animals
</commit_message>
<xml_diff>
--- a/public/assets/monsmecta_wave1-1_dm_letter_a4.docx
+++ b/public/assets/monsmecta_wave1-1_dm_letter_a4.docx
@@ -4,545 +4,109 @@
   <w:body>
     <w:p>
       <w:pPr>
-        <w:spacing w:after="40"/>
-        <w:jc w:val="right"/>
+        <w:pStyle w:val="Heading1"/>
       </w:pPr>
       <w:r>
-        <w:rPr>
-          <w:rFonts w:ascii="맑은 고딕" w:hAnsi="맑은 고딕" w:eastAsia="맑은 고딕"/>
-          <w:b/>
-          <w:color w:val="00513B"/>
-          <w:sz w:val="18"/>
-        </w:rPr>
-        <w:t xml:space="preserve">[Veterinary Exclusive · Wave 1 DM]  </w:t>
-      </w:r>
-      <w:r>
-        <w:rPr>
-          <w:rFonts w:ascii="맑은 고딕" w:hAnsi="맑은 고딕" w:eastAsia="맑은 고딕"/>
-          <w:b/>
-          <w:color w:val="475569"/>
-          <w:sz w:val="18"/>
-        </w:rPr>
-        <w:t>발신: 에스앤제이(S&amp;J) 동물병원 (대표: 홍순일 원장)</w:t>
-        <w:br/>
-        <w:t>수신: 전국 소동물병원 원장님 귀하</w:t>
+        <w:t>에스앤제이(S&amp;J) 동물병원 학술마케팅부 공식 초청 서신</w:t>
       </w:r>
     </w:p>
     <w:p>
-      <w:pPr>
-        <w:spacing w:after="120"/>
-      </w:pPr>
+      <w:r>
+        <w:t>공문번호: S&amp;J-2026-07-W1</w:t>
+      </w:r>
+    </w:p>
+    <w:p/>
+    <w:p>
       <w:r>
         <w:rPr>
-          <w:rFonts w:ascii="맑은 고딕" w:hAnsi="맑은 고딕" w:eastAsia="맑은 고딕"/>
           <w:b/>
-          <w:color w:val="00513B"/>
-          <w:sz w:val="21"/>
         </w:rPr>
-        <w:t>――――――――――――――――――――――――――――――――――――――――――――――――</w:t>
+        <w:t>"가장 먼저 꺼내는 동물용 까스활명수"</w:t>
       </w:r>
     </w:p>
     <w:p>
-      <w:pPr>
-        <w:spacing w:after="160" w:line="276" w:lineRule="auto"/>
-        <w:jc w:val="center"/>
-      </w:pPr>
       <w:r>
         <w:rPr>
-          <w:rFonts w:ascii="맑은 고딕" w:hAnsi="맑은 고딕" w:eastAsia="맑은 고딕"/>
           <w:b/>
-          <w:color w:val="0F172A"/>
-          <w:sz w:val="28"/>
         </w:rPr>
-        <w:t>에스앤제이(S&amp;J) 동물병원 학술마케팅부 공식 초청 서신</w:t>
-        <w:br/>
-      </w:r>
-      <w:r>
-        <w:rPr>
-          <w:rFonts w:ascii="맑은 고딕" w:hAnsi="맑은 고딕" w:eastAsia="맑은 고딕"/>
-          <w:b/>
-          <w:color w:val="00513B"/>
-          <w:sz w:val="23"/>
-        </w:rPr>
-        <w:t>“(전)서울대학교 수의과대학 출신 자문단과 약 6,000례 임상 경험을 기반으로 설계된</w:t>
-        <w:br/>
-        <w:t>수의전용 고미립 장내 유해물질 흡착·제거 보조 솔루션 MONSMECTA 공식 런칭”</w:t>
+        <w:t>"구토·복통·설사·소화불량·식욕부진·섭취거부—모든 동물의 소화기 트러블"</w:t>
       </w:r>
     </w:p>
     <w:p>
-      <w:pPr>
-        <w:spacing w:after="200" w:line="276" w:lineRule="auto"/>
-      </w:pPr>
       <w:r>
         <w:rPr>
-          <w:rFonts w:ascii="맑은 고딕" w:hAnsi="맑은 고딕" w:eastAsia="맑은 고딕"/>
           <w:b/>
-          <w:color w:val="0F172A"/>
-          <w:sz w:val="20"/>
         </w:rPr>
-        <w:t>존경하는 원장님, 안녕하십니까.</w:t>
-        <w:br/>
-      </w:r>
-      <w:r>
-        <w:rPr>
-          <w:rFonts w:ascii="맑은 고딕" w:hAnsi="맑은 고딕" w:eastAsia="맑은 고딕"/>
-          <w:b w:val="0"/>
-          <w:color w:val="1E293B"/>
-          <w:sz w:val="20"/>
-        </w:rPr>
-        <w:t>진료 현장에서 파보·로타·코로나 등 중증 바이러스성 장염 및 설사 환축 치료 시, 장내 수분·독소·바이러스를 강력히 흡착해 설사를 멎게 하고 손상된 위장 점막을 효과적으로 보호하는 천연 점토(스멕타이트/몬모릴로나이트) 성분 흡착성 지사제 솔루션의 필요성을 잘 알고 계실 것입니다.</w:t>
-        <w:br/>
-        <w:t xml:space="preserve">이에 에스앤제이(S&amp;J) 동물병원은 (전)서울대학교 수의과대학 출신 자문단과 함께, </w:t>
-      </w:r>
-      <w:r>
-        <w:rPr>
-          <w:rFonts w:ascii="맑은 고딕" w:hAnsi="맑은 고딕" w:eastAsia="맑은 고딕"/>
-          <w:b/>
-          <w:color w:val="00513B"/>
-          <w:sz w:val="20"/>
-        </w:rPr>
-        <w:t>약 6,000례의 임상 경험을 기반으로 설계된 소동물 전용 천연 고미립 장내 유해물질 흡착·제거 보조제 『몬스멕타(MONSMECTA)』</w:t>
-      </w:r>
-      <w:r>
-        <w:rPr>
-          <w:rFonts w:ascii="맑은 고딕" w:hAnsi="맑은 고딕" w:eastAsia="맑은 고딕"/>
-          <w:b w:val="0"/>
-          <w:color w:val="1E293B"/>
-          <w:sz w:val="20"/>
-        </w:rPr>
-        <w:t>를 공식 런칭하고 전국 5,000개 동물병원 원장님들께 특별 우선 배포를 제안드립니다.</w:t>
+        <w:t>"서울대 수의학 자문단 검증, 천연 고순도 초미세 나노 몬모릴로나이트 흡착·제균 상비 처방 솔루션 MONSMECTA 공식 런칭"</w:t>
       </w:r>
     </w:p>
-    <w:tbl>
-      <w:tblPr>
-        <w:tblW w:type="auto" w:w="0"/>
-        <w:jc w:val="center"/>
-        <w:tblLook w:firstColumn="1" w:firstRow="1" w:lastColumn="0" w:lastRow="0" w:noHBand="0" w:noVBand="1" w:val="04A0"/>
-      </w:tblPr>
-      <w:tblGrid>
-        <w:gridCol w:w="10209"/>
-      </w:tblGrid>
-      <w:tr>
-        <w:tc>
-          <w:tcPr>
-            <w:tcW w:type="dxa" w:w="10210"/>
-            <w:shd w:fill="F0FDF4"/>
-            <w:tcBorders>
-              <w:top w:val="single" w:sz="12" w:space="0" w:color="00513B"/>
-              <w:left w:val="single" w:sz="12" w:space="0" w:color="00513B"/>
-              <w:bottom w:val="single" w:sz="12" w:space="0" w:color="00513B"/>
-              <w:right w:val="single" w:sz="12" w:space="0" w:color="00513B"/>
-            </w:tcBorders>
-            <w:tcMar>
-              <w:top w:w="140" w:type="dxa"/>
-              <w:bottom w:w="140" w:type="dxa"/>
-              <w:left w:w="180" w:type="dxa"/>
-              <w:right w:w="180" w:type="dxa"/>
-            </w:tcMar>
-          </w:tcPr>
-          <w:p>
-            <w:pPr>
-              <w:spacing w:after="120"/>
-            </w:pPr>
-            <w:r>
-              <w:rPr>
-                <w:rFonts w:ascii="맑은 고딕" w:hAnsi="맑은 고딕" w:eastAsia="맑은 고딕"/>
-                <w:b/>
-                <w:color w:val="00513B"/>
-                <w:sz w:val="20"/>
-              </w:rPr>
-              <w:t>■ 바이러스학 분야 권위자 및 임상 자문단 검증 코멘트</w:t>
-            </w:r>
-          </w:p>
-          <w:p>
-            <w:pPr>
-              <w:spacing w:after="80" w:line="269" w:lineRule="auto"/>
-            </w:pPr>
-            <w:r>
-              <w:rPr>
-                <w:rFonts w:ascii="맑은 고딕" w:hAnsi="맑은 고딕" w:eastAsia="맑은 고딕"/>
-                <w:b/>
-                <w:color w:val="0F172A"/>
-                <w:sz w:val="19"/>
-              </w:rPr>
-              <w:t xml:space="preserve">[바이러스학] 박봉균 교수 (전 농림축산검역본부장, 바이러스학 분야 권위자): </w:t>
-            </w:r>
-            <w:r>
-              <w:rPr>
-                <w:rFonts w:ascii="맑은 고딕" w:hAnsi="맑은 고딕" w:eastAsia="맑은 고딕"/>
-                <w:b w:val="0"/>
-                <w:color w:val="334155"/>
-                <w:sz w:val="19"/>
-              </w:rPr>
-              <w:t>“일반 지사제와 달리 1-Deoxynojirimycin(DNJ)의 여러 바이러스 억제 효과와 차별화된 장내 유해물질 흡착력은 임상 진료에서 매우 강력한 강점입니다.”</w:t>
-            </w:r>
-          </w:p>
-          <w:p>
-            <w:pPr>
-              <w:spacing w:after="80" w:line="269" w:lineRule="auto"/>
-            </w:pPr>
-            <w:r>
-              <w:rPr>
-                <w:rFonts w:ascii="맑은 고딕" w:hAnsi="맑은 고딕" w:eastAsia="맑은 고딕"/>
-                <w:b/>
-                <w:color w:val="0F172A"/>
-                <w:sz w:val="19"/>
-              </w:rPr>
-              <w:t xml:space="preserve">[임상검증] 정성대 원장 (동진동물병원 원장): </w:t>
-            </w:r>
-            <w:r>
-              <w:rPr>
-                <w:rFonts w:ascii="맑은 고딕" w:hAnsi="맑은 고딕" w:eastAsia="맑은 고딕"/>
-                <w:b w:val="0"/>
-                <w:color w:val="334155"/>
-                <w:sz w:val="19"/>
-              </w:rPr>
-              <w:t>“입자도, 수분 흡수율, 비표면적... 수의사가 진료실에서 처방할 때 가장 알고 싶어 하는 정확한 물성 데이터가 완벽하게 규명되었습니다.”</w:t>
-            </w:r>
-          </w:p>
-          <w:p>
-            <w:pPr>
-              <w:spacing w:after="80" w:line="269" w:lineRule="auto"/>
-            </w:pPr>
-            <w:r>
-              <w:rPr>
-                <w:rFonts w:ascii="맑은 고딕" w:hAnsi="맑은 고딕" w:eastAsia="맑은 고딕"/>
-                <w:b/>
-                <w:color w:val="0F172A"/>
-                <w:sz w:val="19"/>
-              </w:rPr>
-              <w:t xml:space="preserve">[회복단축] 김동준 원장 (사랑동물병원 원장): </w:t>
-            </w:r>
-            <w:r>
-              <w:rPr>
-                <w:rFonts w:ascii="맑은 고딕" w:hAnsi="맑은 고딕" w:eastAsia="맑은 고딕"/>
-                <w:b w:val="0"/>
-                <w:color w:val="334155"/>
-                <w:sz w:val="19"/>
-              </w:rPr>
-              <w:t>“정맥 수액(IV) 처치와 병행 투여 시, 장점막을 이중 보호하고 전해질 밸런스를 맞춰 파보 장염 환축의 증상 회복 기간 단축에 큰 도움을 줍니다.”</w:t>
-            </w:r>
-          </w:p>
-        </w:tc>
-      </w:tr>
-    </w:tbl>
+    <w:p/>
     <w:p>
-      <w:pPr>
-        <w:spacing w:before="160" w:after="160"/>
-      </w:pPr>
+      <w:r>
+        <w:t>존경하는 원장님, 안녕하십니까.</w:t>
+      </w:r>
     </w:p>
-    <w:tbl>
-      <w:tblPr>
-        <w:tblW w:type="auto" w:w="0"/>
-        <w:jc w:val="center"/>
-        <w:tblLook w:firstColumn="1" w:firstRow="1" w:lastColumn="0" w:lastRow="0" w:noHBand="0" w:noVBand="1" w:val="04A0"/>
-      </w:tblPr>
-      <w:tblGrid>
-        <w:gridCol w:w="10209"/>
-      </w:tblGrid>
-      <w:tr>
-        <w:tc>
-          <w:tcPr>
-            <w:tcW w:type="dxa" w:w="10210"/>
-            <w:shd w:fill="F0FDF4"/>
-            <w:tcBorders>
-              <w:top w:val="single" w:sz="12" w:space="0" w:color="00513B"/>
-              <w:left w:val="single" w:sz="12" w:space="0" w:color="00513B"/>
-              <w:bottom w:val="single" w:sz="12" w:space="0" w:color="00513B"/>
-              <w:right w:val="single" w:sz="12" w:space="0" w:color="00513B"/>
-            </w:tcBorders>
-            <w:tcMar>
-              <w:top w:w="140" w:type="dxa"/>
-              <w:bottom w:w="140" w:type="dxa"/>
-              <w:left w:w="160" w:type="dxa"/>
-              <w:right w:w="160" w:type="dxa"/>
-            </w:tcMar>
-          </w:tcPr>
-          <w:p>
-            <w:pPr>
-              <w:spacing w:after="120" w:line="276" w:lineRule="auto"/>
-              <w:jc w:val="center"/>
-            </w:pPr>
-            <w:r>
-              <w:rPr>
-                <w:rFonts w:ascii="맑은 고딕" w:hAnsi="맑은 고딕" w:eastAsia="맑은 고딕"/>
-                <w:b/>
-                <w:color w:val="00513B"/>
-                <w:sz w:val="20"/>
-              </w:rPr>
-              <w:t xml:space="preserve">[Wave 1 초도 양산 한정 선착순 우선 공급] </w:t>
-            </w:r>
-            <w:r>
-              <w:rPr>
-                <w:rFonts w:ascii="맑은 고딕" w:hAnsi="맑은 고딕" w:eastAsia="맑은 고딕"/>
-                <w:b/>
-                <w:color w:val="0F172A"/>
-                <w:sz w:val="21"/>
-              </w:rPr>
-              <w:t>전국 소동물병원 5,000처 중 단 170개 병원 선착순 배포</w:t>
-              <w:br/>
-            </w:r>
-            <w:r>
-              <w:rPr>
-                <w:rFonts w:ascii="맑은 고딕" w:hAnsi="맑은 고딕" w:eastAsia="맑은 고딕"/>
-                <w:b w:val="0"/>
-                <w:color w:val="475569"/>
-                <w:sz w:val="18"/>
-              </w:rPr>
-              <w:t>복잡한 주소 입력 없이 스마트폰 카메라로 아래 QR코드를 스캔하시면 1초 만에 접수 및 학술 데이터 열람이 가능합니다.</w:t>
-            </w:r>
-          </w:p>
-          <w:tbl>
-            <w:tblPr>
-              <w:tblW w:type="auto" w:w="0"/>
-              <w:jc w:val="center"/>
-              <w:tblLook w:firstColumn="1" w:firstRow="1" w:lastColumn="0" w:lastRow="0" w:noHBand="0" w:noVBand="1" w:val="04A0"/>
-            </w:tblPr>
-            <w:tblGrid>
-              <w:gridCol w:w="5105"/>
-              <w:gridCol w:w="5105"/>
-            </w:tblGrid>
-            <w:tr>
-              <w:tc>
-                <w:tcPr>
-                  <w:tcW w:type="dxa" w:w="4824"/>
-                  <w:shd w:fill="FFFFFF"/>
-                  <w:tcBorders>
-                    <w:top w:val="single" w:sz="6" w:space="0" w:color="00513B"/>
-                    <w:left w:val="single" w:sz="6" w:space="0" w:color="00513B"/>
-                    <w:bottom w:val="single" w:sz="6" w:space="0" w:color="00513B"/>
-                    <w:right w:val="single" w:sz="6" w:space="0" w:color="00513B"/>
-                  </w:tcBorders>
-                  <w:tcMar>
-                    <w:top w:w="100" w:type="dxa"/>
-                    <w:bottom w:w="100" w:type="dxa"/>
-                    <w:left w:w="100" w:type="dxa"/>
-                    <w:right w:w="100" w:type="dxa"/>
-                  </w:tcMar>
-                </w:tcPr>
-                <w:p>
-                  <w:pPr>
-                    <w:spacing w:after="60"/>
-                    <w:jc w:val="center"/>
-                  </w:pPr>
-                  <w:r>
-                    <w:drawing>
-                      <wp:inline xmlns:a="http://schemas.openxmlformats.org/drawingml/2006/main" xmlns:pic="http://schemas.openxmlformats.org/drawingml/2006/picture">
-                        <wp:extent cx="868680" cy="868680"/>
-                        <wp:docPr id="1" name="Picture 1"/>
-                        <wp:cNvGraphicFramePr>
-                          <a:graphicFrameLocks noChangeAspect="1"/>
-                        </wp:cNvGraphicFramePr>
-                        <a:graphic>
-                          <a:graphicData uri="http://schemas.openxmlformats.org/drawingml/2006/picture">
-                            <pic:pic>
-                              <pic:nvPicPr>
-                                <pic:cNvPr id="0" name="monsmecta_qrcode_snj1.png"/>
-                                <pic:cNvPicPr/>
-                              </pic:nvPicPr>
-                              <pic:blipFill>
-                                <a:blip r:embed="rId9"/>
-                                <a:stretch>
-                                  <a:fillRect/>
-                                </a:stretch>
-                              </pic:blipFill>
-                              <pic:spPr>
-                                <a:xfrm>
-                                  <a:off x="0" y="0"/>
-                                  <a:ext cx="868680" cy="868680"/>
-                                </a:xfrm>
-                                <a:prstGeom prst="rect"/>
-                              </pic:spPr>
-                            </pic:pic>
-                          </a:graphicData>
-                        </a:graphic>
-                      </wp:inline>
-                    </w:drawing>
-                  </w:r>
-                </w:p>
-                <w:p>
-                  <w:pPr>
-                    <w:spacing w:after="0" w:line="269" w:lineRule="auto"/>
-                    <w:jc w:val="center"/>
-                  </w:pPr>
-                  <w:r>
-                    <w:rPr>
-                      <w:rFonts w:ascii="맑은 고딕" w:hAnsi="맑은 고딕" w:eastAsia="맑은 고딕"/>
-                      <w:b/>
-                      <w:color w:val="00513B"/>
-                      <w:sz w:val="17"/>
-                    </w:rPr>
-                    <w:t>[QR CODE 01]</w:t>
-                    <w:br/>
-                  </w:r>
-                  <w:r>
-                    <w:rPr>
-                      <w:rFonts w:ascii="맑은 고딕" w:hAnsi="맑은 고딕" w:eastAsia="맑은 고딕"/>
-                      <w:b/>
-                      <w:color w:val="0F172A"/>
-                      <w:sz w:val="18"/>
-                    </w:rPr>
-                    <w:t>📦 초도 170세트 발주 및 특별 접수 QR</w:t>
-                    <w:br/>
-                  </w:r>
-                  <w:r>
-                    <w:rPr>
-                      <w:rFonts w:ascii="맑은 고딕" w:hAnsi="맑은 고딕" w:eastAsia="맑은 고딕"/>
-                      <w:b w:val="0"/>
-                      <w:color w:val="64748B"/>
-                      <w:sz w:val="16"/>
-                    </w:rPr>
-                    <w:t>카메라 스캔 시 즉시 병원 인증 및 접수</w:t>
-                  </w:r>
-                </w:p>
-              </w:tc>
-              <w:tc>
-                <w:tcPr>
-                  <w:tcW w:type="dxa" w:w="4824"/>
-                  <w:shd w:fill="FFFFFF"/>
-                  <w:tcBorders>
-                    <w:top w:val="single" w:sz="6" w:space="0" w:color="00513B"/>
-                    <w:left w:val="single" w:sz="6" w:space="0" w:color="00513B"/>
-                    <w:bottom w:val="single" w:sz="6" w:space="0" w:color="00513B"/>
-                    <w:right w:val="single" w:sz="6" w:space="0" w:color="00513B"/>
-                  </w:tcBorders>
-                  <w:tcMar>
-                    <w:top w:w="100" w:type="dxa"/>
-                    <w:bottom w:w="100" w:type="dxa"/>
-                    <w:left w:w="100" w:type="dxa"/>
-                    <w:right w:w="100" w:type="dxa"/>
-                  </w:tcMar>
-                </w:tcPr>
-                <w:p>
-                  <w:pPr>
-                    <w:spacing w:after="60"/>
-                    <w:jc w:val="center"/>
-                  </w:pPr>
-                  <w:r>
-                    <w:drawing>
-                      <wp:inline xmlns:a="http://schemas.openxmlformats.org/drawingml/2006/main" xmlns:pic="http://schemas.openxmlformats.org/drawingml/2006/picture">
-                        <wp:extent cx="868680" cy="868680"/>
-                        <wp:docPr id="2" name="Picture 2"/>
-                        <wp:cNvGraphicFramePr>
-                          <a:graphicFrameLocks noChangeAspect="1"/>
-                        </wp:cNvGraphicFramePr>
-                        <a:graphic>
-                          <a:graphicData uri="http://schemas.openxmlformats.org/drawingml/2006/picture">
-                            <pic:pic>
-                              <pic:nvPicPr>
-                                <pic:cNvPr id="0" name="monsmecta_qrcode_snj2.png"/>
-                                <pic:cNvPicPr/>
-                              </pic:nvPicPr>
-                              <pic:blipFill>
-                                <a:blip r:embed="rId10"/>
-                                <a:stretch>
-                                  <a:fillRect/>
-                                </a:stretch>
-                              </pic:blipFill>
-                              <pic:spPr>
-                                <a:xfrm>
-                                  <a:off x="0" y="0"/>
-                                  <a:ext cx="868680" cy="868680"/>
-                                </a:xfrm>
-                                <a:prstGeom prst="rect"/>
-                              </pic:spPr>
-                            </pic:pic>
-                          </a:graphicData>
-                        </a:graphic>
-                      </wp:inline>
-                    </w:drawing>
-                  </w:r>
-                </w:p>
-                <w:p>
-                  <w:pPr>
-                    <w:spacing w:after="0" w:line="269" w:lineRule="auto"/>
-                    <w:jc w:val="center"/>
-                  </w:pPr>
-                  <w:r>
-                    <w:rPr>
-                      <w:rFonts w:ascii="맑은 고딕" w:hAnsi="맑은 고딕" w:eastAsia="맑은 고딕"/>
-                      <w:b/>
-                      <w:color w:val="00513B"/>
-                      <w:sz w:val="17"/>
-                    </w:rPr>
-                    <w:t>[QR CODE 02]</w:t>
-                    <w:br/>
-                  </w:r>
-                  <w:r>
-                    <w:rPr>
-                      <w:rFonts w:ascii="맑은 고딕" w:hAnsi="맑은 고딕" w:eastAsia="맑은 고딕"/>
-                      <w:b/>
-                      <w:color w:val="0F172A"/>
-                      <w:sz w:val="18"/>
-                    </w:rPr>
-                    <w:t>📊 자문단 학술 데이터 및 시나리오 QR</w:t>
-                    <w:br/>
-                  </w:r>
-                  <w:r>
-                    <w:rPr>
-                      <w:rFonts w:ascii="맑은 고딕" w:hAnsi="맑은 고딕" w:eastAsia="맑은 고딕"/>
-                      <w:b w:val="0"/>
-                      <w:color w:val="64748B"/>
-                      <w:sz w:val="16"/>
-                    </w:rPr>
-                    <w:t>(전)서울대 출신 자문단 데이터 및 상담 시나리오 열람</w:t>
-                  </w:r>
-                </w:p>
-              </w:tc>
-            </w:tr>
-          </w:tbl>
-          <w:p/>
-        </w:tc>
-      </w:tr>
-    </w:tbl>
     <w:p>
-      <w:pPr>
-        <w:spacing w:before="160" w:after="0" w:line="276" w:lineRule="auto"/>
-        <w:jc w:val="center"/>
-      </w:pPr>
       <w:r>
-        <w:rPr>
-          <w:rFonts w:ascii="맑은 고딕" w:hAnsi="맑은 고딕" w:eastAsia="맑은 고딕"/>
-          <w:b w:val="0"/>
-          <w:color w:val="CBD5E1"/>
-          <w:sz w:val="17"/>
-        </w:rPr>
-        <w:t>――――――――――――――――――――――――――――――――――――――――――――――――</w:t>
-        <w:br/>
+        <w:t>진료 현장에서 원인 불명의 구토, 묽은 변, 가스 참, 사료 교체기 소화불량, 식욕부진, 섭취거부 및 중증 장염 환축을 진료하시며, 투약 거부나 구토로 인한 약물 투여의 어려움, 단순히 분변의 수분만 흡수하여 변을 굳히는 기존 인체약 지사제의 한계를 느끼지 않으셨습니까?</w:t>
       </w:r>
+    </w:p>
+    <w:p>
       <w:r>
-        <w:rPr>
-          <w:rFonts w:ascii="맑은 고딕" w:hAnsi="맑은 고딕" w:eastAsia="맑은 고딕"/>
-          <w:b/>
-          <w:color w:val="334155"/>
-          <w:sz w:val="17"/>
-        </w:rPr>
-        <w:t>에스앤제이(S&amp;J) 동물병원 | 대표: 홍순일 (닥터 젬스홍) | 사업자번호: 792-66-00615</w:t>
-        <w:br/>
+        <w:t>소화기 트러블 발생 시 현장에서 가장 먼저 비치하고 수시로 투여할 수 있는 '동물용 까스활명수' 개념의 1차 상비·처방 솔루션이 절실한 이유입니다.</w:t>
       </w:r>
+    </w:p>
+    <w:p>
       <w:r>
-        <w:rPr>
-          <w:rFonts w:ascii="맑은 고딕" w:hAnsi="맑은 고딕" w:eastAsia="맑은 고딕"/>
-          <w:b/>
-          <w:color w:val="00513B"/>
-          <w:sz w:val="17"/>
-        </w:rPr>
-        <w:t>주소: 경기도 용인시 처인구 포곡읍 선장1로 98-8 | 대표 연락처: 031-321-6562 | 공식 이메일: soonilhong@naver.com</w:t>
-        <w:br/>
+        <w:t>이에 에스앤제이(S&amp;J) 동물병원은 (전)서울대학교 수의과대학 출신 자문단의 임상 경험을 바탕으로 설계된, 강아지·고양이는 물론 조류, 소형포유류(토끼·햄스터), 파충류 등 모든 동물의 소화기 건강을 케어하는 천연 고순도 초미세 나노 몬모릴로나이트 장내 유해물질 흡착·제거 보조제 『몬스멕타(MONSMECTA)』를 공식 런칭하고 전국 5,000개 동물병원 원장님들께 특별 우선 배포를 제안드립니다.</w:t>
       </w:r>
+    </w:p>
+    <w:p/>
+    <w:p>
       <w:r>
-        <w:rPr>
-          <w:rFonts w:ascii="맑은 고딕" w:hAnsi="맑은 고딕" w:eastAsia="맑은 고딕"/>
-          <w:b w:val="0"/>
-          <w:color w:val="94A3B8"/>
-          <w:sz w:val="15"/>
-        </w:rPr>
-        <w:t>※ 본 안내문은 전국 소동물병원 수의사 원장님께 한정하여 발송되는 수의학 전용 학술·처방 안내 문서입니다.</w:t>
+        <w:t>WAVE 1 초도 양산 한정 선착순 우선 공급 | 전국 5,000개 동물병원 중 단 170개 병원 선착순 배포</w:t>
+      </w:r>
+    </w:p>
+    <w:p>
+      <w:r>
+        <w:t>복잡한 주소 입력 없이 스마트폰 카메라로 아래 QR코드를 스캔하시면 1초 만에 접수 및 학술 데이터 열람이 가능합니다.</w:t>
+      </w:r>
+    </w:p>
+    <w:p/>
+    <w:p>
+      <w:r>
+        <w:t>QR CODE 01: 📦 초도 170세트 발주 및 특별 접수 QR (카메라 스캔 시 즉시 병원 인증 및 접수)</w:t>
+      </w:r>
+    </w:p>
+    <w:p>
+      <w:r>
+        <w:t>QR CODE 02: 📊 자문단 학술 데이터 및 전 동물 소화기 처방 시나리오 QR (자문단 데이터 및 상담 시나리오 열람)</w:t>
+      </w:r>
+    </w:p>
+    <w:p/>
+    <w:p>
+      <w:r>
+        <w:t>에스앤제이(S&amp;J) 동물병원</w:t>
+      </w:r>
+    </w:p>
+    <w:p>
+      <w:r>
+        <w:t>대표: 홍순일 (닥터 젬스홍) | 사업자번호: 792-66-00615 | 주소: 경기도 용인시 처인구 포곡읍 선장1로 98-8</w:t>
+      </w:r>
+    </w:p>
+    <w:p>
+      <w:r>
+        <w:t>대표 연락처: 031-321-6562 | 공식 이메일: soonilhong@naver.com</w:t>
+      </w:r>
+    </w:p>
+    <w:p>
+      <w:r>
+        <w:t>※ 본 안내문은 전국 동물병원 수의사 원장님께 한정하여 발송되는 수의학 전용 학술·처방 안내 문서입니다.</w:t>
       </w:r>
     </w:p>
     <w:sectPr>
-      <w:pgSz w:w="11909" w:h="16834"/>
-      <w:pgMar w:top="677" w:right="850" w:bottom="677" w:left="850" w:header="720" w:footer="720" w:gutter="0"/>
+      <w:pgSz w:w="12240" w:h="15840"/>
+      <w:pgMar w:top="1440" w:right="1800" w:bottom="1440" w:left="1800" w:header="720" w:footer="720" w:gutter="0"/>
       <w:cols w:space="720"/>
       <w:docGrid w:linePitch="360"/>
     </w:sectPr>

</xml_diff>

<commit_message>
Update dash character in headline from em-dash to hyphen: 섭취거부-모든 동물의
</commit_message>
<xml_diff>
--- a/public/assets/monsmecta_wave1-1_dm_letter_a4.docx
+++ b/public/assets/monsmecta_wave1-1_dm_letter_a4.docx
@@ -26,10 +26,7 @@
     </w:p>
     <w:p>
       <w:r>
-        <w:rPr>
-          <w:b/>
-        </w:rPr>
-        <w:t>"구토·복통·설사·소화불량·식욕부진·섭취거부—모든 동물의 소화기 트러블"</w:t>
+        <w:t>"구토·복통·설사·소화불량·식욕부진·섭취거부-모든 동물의 소화기 트러블"</w:t>
       </w:r>
     </w:p>
     <w:p>

</xml_diff>

<commit_message>
Replace trademark-sensitive term with trademark-safe wording: 동물용 활기명수
</commit_message>
<xml_diff>
--- a/public/assets/monsmecta_wave1-1_dm_letter_a4.docx
+++ b/public/assets/monsmecta_wave1-1_dm_letter_a4.docx
@@ -18,10 +18,7 @@
     <w:p/>
     <w:p>
       <w:r>
-        <w:rPr>
-          <w:b/>
-        </w:rPr>
-        <w:t>"가장 먼저 꺼내는 동물용 까스활명수"</w:t>
+        <w:t>"가장 먼저 꺼내는 동물용 활기명수"</w:t>
       </w:r>
     </w:p>
     <w:p>
@@ -50,7 +47,7 @@
     </w:p>
     <w:p>
       <w:r>
-        <w:t>소화기 트러블 발생 시 현장에서 가장 먼저 비치하고 수시로 투여할 수 있는 '동물용 까스활명수' 개념의 1차 상비·처방 솔루션이 절실한 이유입니다.</w:t>
+        <w:t>소화기 트러블 발생 시 현장에서 가장 먼저 비치하고 수시로 투여할 수 있는 '동물용 활기명수' 개념의 1차 상비·처방 솔루션이 절실한 이유입니다.</w:t>
       </w:r>
     </w:p>
     <w:p>

</xml_diff>